<commit_message>
Enablement Word copies: the demo map rebuilt with the role, not a name
Co-Authored-By: Claude Fable 5.1 <noreply@anthropic.com>
</commit_message>
<xml_diff>
--- a/docs/enablement/word/Enablement-Which-Demo-to-Show-to-Whom-v1.0.docx
+++ b/docs/enablement/word/Enablement-Which-Demo-to-Show-to-Whom-v1.0.docx
@@ -788,7 +788,7 @@
             <w:pPr>
               <w:spacing w:after="0" w:before="0" w:line="252"/>
             </w:pPr>
-            <w:hyperlink w:history="1" r:id="rId2ky7yfslhcifdxeami1jw">
+            <w:hyperlink w:history="1" r:id="rIdcgjklyatyld-oq1ypwbhc">
               <w:r>
                 <w:rPr>
                   <w:rFonts w:ascii="Calibri" w:cs="Calibri" w:eastAsia="Calibri" w:hAnsi="Calibri"/>
@@ -923,7 +923,7 @@
             <w:pPr>
               <w:spacing w:after="0" w:before="0" w:line="252"/>
             </w:pPr>
-            <w:hyperlink w:history="1" r:id="rIdhsc3q8ggax3md7md0mkl0">
+            <w:hyperlink w:history="1" r:id="rIddpbpkje6jaabn1yce6a2b">
               <w:r>
                 <w:rPr>
                   <w:rFonts w:ascii="Calibri" w:cs="Calibri" w:eastAsia="Calibri" w:hAnsi="Calibri"/>
@@ -1261,7 +1261,7 @@
             <w:pPr>
               <w:spacing w:after="0" w:before="0" w:line="252"/>
             </w:pPr>
-            <w:hyperlink w:history="1" r:id="rId_9mdsj_64cy-5d2o0udy4">
+            <w:hyperlink w:history="1" r:id="rIdmw1sw3kh2xp3gnxib5apq">
               <w:r>
                 <w:rPr>
                   <w:rFonts w:ascii="Calibri" w:cs="Calibri" w:eastAsia="Calibri" w:hAnsi="Calibri"/>
@@ -1396,7 +1396,7 @@
             <w:pPr>
               <w:spacing w:after="0" w:before="0" w:line="252"/>
             </w:pPr>
-            <w:hyperlink w:history="1" r:id="rIdzptmp0uz5c6f6lcftjgma">
+            <w:hyperlink w:history="1" r:id="rIddhtuj_fmepxlce4h24qsn">
               <w:r>
                 <w:rPr>
                   <w:rFonts w:ascii="Calibri" w:cs="Calibri" w:eastAsia="Calibri" w:hAnsi="Calibri"/>
@@ -1417,7 +1417,7 @@
               </w:rPr>
               <w:t xml:space="preserve">, with its Offer Desk at </w:t>
             </w:r>
-            <w:hyperlink w:history="1" r:id="rIduixsg_u9wvougyzi7cut8">
+            <w:hyperlink w:history="1" r:id="rIdmuvtrcectkafhcdpm9wnb">
               <w:r>
                 <w:rPr>
                   <w:rFonts w:ascii="Calibri" w:cs="Calibri" w:eastAsia="Calibri" w:hAnsi="Calibri"/>
@@ -1562,7 +1562,7 @@
         </w:rPr>
         <w:t xml:space="preserve">Vantage's interactive explainer, </w:t>
       </w:r>
-      <w:hyperlink w:history="1" r:id="rIdh3kss6evgrvb2b6x1orpw">
+      <w:hyperlink w:history="1" r:id="rIdrfftxzgxdj4micja6mioi">
         <w:r>
           <w:rPr>
             <w:rFonts w:ascii="Calibri" w:cs="Calibri" w:eastAsia="Calibri" w:hAnsi="Calibri"/>
@@ -1825,7 +1825,7 @@
           <w:sz w:val="21"/>
           <w:szCs w:val="21"/>
         </w:rPr>
-        <w:t xml:space="preserve">Vantage's regional data has a one-day memory and is reseeded before a showing, so ask the demos' owner (Simone Coelho) before a customer sees any demo.</w:t>
+        <w:t xml:space="preserve">Vantage's regional data has a one-day memory and is reseeded before a showing, so ask the demo owner before a customer sees any demo.</w:t>
       </w:r>
     </w:p>
     <w:p>

</xml_diff>